<commit_message>
feat: Implement tax breakdown in Cotizacion module; Refactor Seguimiento logic to update Visita stage and Cotizacion.Confirmacion; Add error handling for duplicate Impuesto codes; Clean up git tracking of build artifacts.
</commit_message>
<xml_diff>
--- a/SO/SolucionTecmein/Contexto/Proceso TECMEIN S A.docx
+++ b/SO/SolucionTecmein/Contexto/Proceso TECMEIN S A.docx
@@ -26,6 +26,410 @@
           <w:i/>
           <w:iCs/>
         </w:rPr>
+        <w:t>Contexto general del proyecto:</w:t>
+      </w:r>
+    </w:p>
+    <w:p>
+      <w:r>
+        <w:t xml:space="preserve">La empresa </w:t>
+      </w:r>
+      <w:proofErr w:type="spellStart"/>
+      <w:r>
+        <w:t>Tecmenin</w:t>
+      </w:r>
+      <w:proofErr w:type="spellEnd"/>
+      <w:r>
+        <w:t xml:space="preserve"> S A. </w:t>
+      </w:r>
+      <w:r>
+        <w:t>se dedica a la venta y mantenimiento de Ascensores eléctricos, escaleras eléctricas y bandas de trasporte para personas.</w:t>
+      </w:r>
+    </w:p>
+    <w:p>
+      <w:r>
+        <w:t xml:space="preserve">En el Proyecto </w:t>
+      </w:r>
+      <w:proofErr w:type="spellStart"/>
+      <w:r>
+        <w:t>Tecmein</w:t>
+      </w:r>
+      <w:proofErr w:type="spellEnd"/>
+      <w:r>
+        <w:t xml:space="preserve"> se busca automatizar y controlar al personal </w:t>
+      </w:r>
+      <w:r>
+        <w:t>así</w:t>
+      </w:r>
+      <w:r>
+        <w:t xml:space="preserve"> como automatizar los procesos de visitas que se define como el momento en el cual el visitador llega a la edificación donde se van a instalar los equipos y hace una primera inspección donde revisa los ductos o las áreas donde se van a instalar los equipos y necesita llenar una serie de campos que nos dan las dimensiones del proyecto y detalles como si quiere que los botones de ascensor manejen alguna especificación especial o el número de entradas frontales y posteriores. </w:t>
+      </w:r>
+      <w:r>
+        <w:br/>
+      </w:r>
+      <w:r>
+        <w:br/>
+        <w:t xml:space="preserve">La Empresa requiere </w:t>
+      </w:r>
+      <w:r>
+        <w:t>poder tener control de los visitadores saber si realmente estuvieron en el punto indicado por esa razón se guarda el punto de ubicación condenadas al momento de crear la visita, de esa manera se debe poder asociar la visita a un usuario ya que esto nos servirá más adelante para poder hacer reportes y calcular comisiones ganadas por los proyectos</w:t>
+      </w:r>
+      <w:r>
+        <w:t xml:space="preserve"> captados</w:t>
+      </w:r>
+      <w:r>
+        <w:t>.</w:t>
+      </w:r>
+      <w:r>
+        <w:br/>
+      </w:r>
+      <w:r>
+        <w:br/>
+        <w:t>Los proyectos son alrededor de todo el Ecuador por lo que se agregaron listas desplegables con provincia cantón y parroquia para especificar a qué lugar del país se refiere la dirección registrada.</w:t>
+      </w:r>
+      <w:r>
+        <w:br/>
+      </w:r>
+      <w:r>
+        <w:br/>
+      </w:r>
+      <w:r>
+        <w:t>Registrada la visita esta sigue una serie de pasos para poder llegar a concretar un contrato con el cual se pueda trabajar,</w:t>
+      </w:r>
+      <w:r>
+        <w:t xml:space="preserve"> los pasos son visita – cotización – seguimiento – Pre Contrato – Contrato estos son los pasos  incluido el contrato.</w:t>
+      </w:r>
+      <w:r>
+        <w:br/>
+      </w:r>
+      <w:r>
+        <w:br/>
+        <w:t>Finalizada la obra el proyecto entra a un periodo de garantía en el cual se definirá bajo acuerdo de las partes.</w:t>
+      </w:r>
+      <w:r>
+        <w:br/>
+      </w:r>
+    </w:p>
+    <w:p>
+      <w:r>
+        <w:t>Los contratos se definen como contrato Equipo Nuevo, Contrato Garantía, Contrato de Mantenimiento. Por lo que el sistema debe poder manejar estos procesos post Entrega del equipo instalado en el proyecto.</w:t>
+      </w:r>
+      <w:r>
+        <w:br/>
+      </w:r>
+    </w:p>
+    <w:p>
+      <w:r>
+        <w:t>Como podemos entender ya a este punto los proyectos pueden ser contratados por grandes constructoras o personas particulares por lo que se están manejando una única definición como constructora y estas constructora tiene un contacto/un administrador/ jefe de</w:t>
+      </w:r>
+      <w:r>
+        <w:t xml:space="preserve"> </w:t>
+      </w:r>
+      <w:r>
+        <w:t xml:space="preserve">Obra de dicho proyecto que va a ser con quien coordinemos el proceso y avance de la instalación del proyecto en el caso de ser una </w:t>
+      </w:r>
+      <w:r>
+        <w:t>persona natural, se ha pensado en manejarlo de la misma manera</w:t>
+      </w:r>
+      <w:r>
+        <w:t xml:space="preserve"> </w:t>
+      </w:r>
+      <w:r>
+        <w:t xml:space="preserve">que esta persona debe ser creado como una constructora y poder registrar a la misma persona constructora como contacto. Ahora estas constructoras y contactos registrados en el sistema mientras no hayan tenido algún proyecto con la empresa </w:t>
+      </w:r>
+      <w:proofErr w:type="spellStart"/>
+      <w:r>
+        <w:t>Tecmein</w:t>
+      </w:r>
+      <w:proofErr w:type="spellEnd"/>
+      <w:r>
+        <w:t xml:space="preserve"> y tengamos solo visitas registradas no se los puede aun considerar como </w:t>
+      </w:r>
+      <w:r>
+        <w:rPr>
+          <w:b/>
+          <w:bCs/>
+        </w:rPr>
+        <w:t>Clientes</w:t>
+      </w:r>
+      <w:r>
+        <w:rPr>
+          <w:b/>
+          <w:bCs/>
+        </w:rPr>
+        <w:t xml:space="preserve"> </w:t>
+      </w:r>
+      <w:r>
+        <w:t xml:space="preserve">nuestros clientes son constructoras o personas que tengan o hayan tenido algún contrato con la empresa. Por lo que </w:t>
+      </w:r>
+      <w:r>
+        <w:lastRenderedPageBreak/>
+        <w:t xml:space="preserve">se requiere que una vez </w:t>
+      </w:r>
+      <w:r>
+        <w:t>firmado el contrato</w:t>
+      </w:r>
+      <w:r>
+        <w:t xml:space="preserve"> la constructora se convierta en cliente de la empresa.</w:t>
+      </w:r>
+      <w:r>
+        <w:br/>
+      </w:r>
+      <w:r>
+        <w:br/>
+        <w:t xml:space="preserve">Que es ser cliente de </w:t>
+      </w:r>
+      <w:proofErr w:type="spellStart"/>
+      <w:r>
+        <w:t>Tecmein</w:t>
+      </w:r>
+      <w:proofErr w:type="spellEnd"/>
+      <w:r>
+        <w:t xml:space="preserve"> se le da un numero el cual debe ser una secuencia iniciada bajo un formato no especificado para esta parte pienso que debemos crear un mantenimiento (Entidad) que se llame </w:t>
+      </w:r>
+      <w:proofErr w:type="spellStart"/>
+      <w:r>
+        <w:t>FormatoNumeroCliente</w:t>
+      </w:r>
+      <w:proofErr w:type="spellEnd"/>
+      <w:r>
+        <w:t xml:space="preserve"> donde tengamos los campos </w:t>
+      </w:r>
+      <w:proofErr w:type="spellStart"/>
+      <w:r>
+        <w:t>secEmpresa</w:t>
+      </w:r>
+      <w:proofErr w:type="spellEnd"/>
+      <w:r>
+        <w:t xml:space="preserve"> </w:t>
+      </w:r>
+      <w:proofErr w:type="spellStart"/>
+      <w:r>
+        <w:t>int</w:t>
+      </w:r>
+      <w:proofErr w:type="spellEnd"/>
+      <w:r>
+        <w:t xml:space="preserve">, </w:t>
+      </w:r>
+      <w:proofErr w:type="spellStart"/>
+      <w:r>
+        <w:t>usaFormato</w:t>
+      </w:r>
+      <w:proofErr w:type="spellEnd"/>
+      <w:r>
+        <w:t xml:space="preserve"> </w:t>
+      </w:r>
+      <w:proofErr w:type="spellStart"/>
+      <w:r>
+        <w:t>bool</w:t>
+      </w:r>
+      <w:proofErr w:type="spellEnd"/>
+      <w:r>
+        <w:t xml:space="preserve">, </w:t>
+      </w:r>
+      <w:proofErr w:type="spellStart"/>
+      <w:r>
+        <w:t>FormatoNumeroCliente</w:t>
+      </w:r>
+      <w:proofErr w:type="spellEnd"/>
+      <w:r>
+        <w:t xml:space="preserve">, </w:t>
+      </w:r>
+      <w:proofErr w:type="spellStart"/>
+      <w:r>
+        <w:t>numeroClienteInicio</w:t>
+      </w:r>
+      <w:proofErr w:type="spellEnd"/>
+      <w:r>
+        <w:t xml:space="preserve">, cual es el fin poder registrar o diferenciar si el numero de cliente va a llevar un formato especial talvez un texto previo (ej. </w:t>
+      </w:r>
+      <w:proofErr w:type="spellStart"/>
+      <w:r>
+        <w:t>Cli-numerocliente</w:t>
+      </w:r>
+      <w:proofErr w:type="spellEnd"/>
+      <w:r>
+        <w:t xml:space="preserve"> o </w:t>
+      </w:r>
+      <w:proofErr w:type="spellStart"/>
+      <w:r>
+        <w:t>empresanumerocliente</w:t>
+      </w:r>
+      <w:proofErr w:type="spellEnd"/>
+      <w:r>
+        <w:t xml:space="preserve">) el campo </w:t>
+      </w:r>
+      <w:proofErr w:type="spellStart"/>
+      <w:r>
+        <w:t>bool</w:t>
+      </w:r>
+      <w:proofErr w:type="spellEnd"/>
+      <w:r>
+        <w:t xml:space="preserve"> nos permite </w:t>
+      </w:r>
+      <w:proofErr w:type="spellStart"/>
+      <w:r>
+        <w:t>defiir</w:t>
+      </w:r>
+      <w:proofErr w:type="spellEnd"/>
+      <w:r>
+        <w:t xml:space="preserve"> si usa o no la casilla formato y el numero cliente inicio se puede poner cualquier </w:t>
+      </w:r>
+      <w:r>
+        <w:t>número</w:t>
+      </w:r>
+      <w:r>
+        <w:t xml:space="preserve"> </w:t>
+      </w:r>
+      <w:r>
+        <w:t>superior o igual al número mayor registrado en la tabla cliente.</w:t>
+      </w:r>
+      <w:r>
+        <w:br/>
+      </w:r>
+      <w:r>
+        <w:br/>
+        <w:t>La tabla cliente va asociar constructora y este numero junto con su respectivo secuencial por lo</w:t>
+      </w:r>
+      <w:r>
+        <w:br/>
+      </w:r>
+    </w:p>
+    <w:p>
+      <w:pPr>
+        <w:rPr>
+          <w:b/>
+          <w:bCs/>
+          <w:i/>
+          <w:iCs/>
+        </w:rPr>
+      </w:pPr>
+      <w:r>
+        <w:t>El proyecto debe manejar un mantenimiento donde se pueda especificar</w:t>
+      </w:r>
+      <w:r>
+        <w:t xml:space="preserve"> las plantillas de correo electrónico que se va a usar, en el proceso de cotización debe tener un botón el cual nos permita</w:t>
+      </w:r>
+      <w:r>
+        <w:t xml:space="preserve"> generar un </w:t>
+      </w:r>
+      <w:proofErr w:type="spellStart"/>
+      <w:r>
+        <w:t>pdf</w:t>
+      </w:r>
+      <w:proofErr w:type="spellEnd"/>
+      <w:r>
+        <w:t xml:space="preserve"> detalla</w:t>
+      </w:r>
+      <w:r>
+        <w:t>ndo</w:t>
+      </w:r>
+      <w:r>
+        <w:t xml:space="preserve"> la información del equipo</w:t>
+      </w:r>
+      <w:r>
+        <w:t xml:space="preserve"> requerido</w:t>
+      </w:r>
+      <w:r>
+        <w:t xml:space="preserve"> y poder enviar el correo a la fábrica en china</w:t>
+      </w:r>
+      <w:r>
+        <w:t xml:space="preserve"> o Europa</w:t>
+      </w:r>
+      <w:r>
+        <w:t xml:space="preserve"> la cual nos va a dar el precio del equipo.</w:t>
+      </w:r>
+      <w:r>
+        <w:br/>
+        <w:t xml:space="preserve"> </w:t>
+      </w:r>
+      <w:r>
+        <w:br/>
+        <w:t xml:space="preserve">una vez tenemos los precios del equipo podemos llenar la casilla valor </w:t>
+      </w:r>
+      <w:r>
+        <w:t>y aplicar el margen de ganancia una vez guardado ya con valores la cotización se activara otro botón que nos permita enviar el un correo con la cotización al contacto de la constructora para esperar su aprobación</w:t>
+      </w:r>
+      <w:r>
+        <w:br/>
+      </w:r>
+      <w:r>
+        <w:br/>
+        <w:t>En este punto debe entrar la pantalla de seguimientos esta pantalla nos permite recoger las cotizaciones enviadas a los clientes y darles el seguimiento, registrar si se llamó se envió un correo si se tuvo respuesta o alguna especificación del seguimiento realizado hasta poder conseguir el aceptación del cliente.</w:t>
+      </w:r>
+      <w:r>
+        <w:br/>
+      </w:r>
+      <w:r>
+        <w:br/>
+        <w:t>Pasamos a los procesos de precontrato de igual manera se necesita poder crear el</w:t>
+      </w:r>
+      <w:r>
+        <w:t xml:space="preserve"> pre</w:t>
+      </w:r>
+      <w:r>
+        <w:t xml:space="preserve"> contrato desde el sistema</w:t>
+      </w:r>
+      <w:r>
+        <w:t>,</w:t>
+      </w:r>
+      <w:r>
+        <w:t xml:space="preserve"> bajo plantillas predefinidas</w:t>
+      </w:r>
+      <w:r>
+        <w:t>, estas plantillas predefinidas debe poderlas crear el usuario del sistema. Por lo que serán un registro en la base de datos la cual contienen un nombre contrato numeración inicial y el detalle vamos a poder ingresar un listado de párrafos los cuales tendrán un orden de ubicación en el documento y mediante una tabla definida como parámetros de contrato cuadraremos las palabras clave para q se pueda reemplazar estas palabras por los valores del sistema generando en primera instancia un documento de Word Editable. De esa manera los operarios del sistema enviaran los precontratos definidos por la empresa como son precontratos son sujeto a cambios que se deben revisar.</w:t>
+      </w:r>
+      <w:r>
+        <w:br/>
+      </w:r>
+      <w:r>
+        <w:br/>
+        <w:t xml:space="preserve">El momento de aceptar el precontrato este se debe confirmar ya en la </w:t>
+      </w:r>
+      <w:r>
+        <w:t>generación</w:t>
+      </w:r>
+      <w:r>
+        <w:t xml:space="preserve"> del contrato par</w:t>
+      </w:r>
+      <w:r>
+        <w:t>a</w:t>
+      </w:r>
+      <w:r>
+        <w:t xml:space="preserve"> ese momento ya </w:t>
+      </w:r>
+      <w:r>
+        <w:t>no se podrá editar más los precontratos los que se pueden agregar es un anexo a manera de una especificación solicitada por alguna de las partes esta parte de anexos debe manearse de igual manera que los párrafos de  contrato bajo plantillas de contrato y parámetros.</w:t>
+      </w:r>
+      <w:r>
+        <w:br/>
+      </w:r>
+      <w:r>
+        <w:br/>
+        <w:t>este proceso nos permitirá poder emitir contratos por diferentes proceso y estados de la obra.</w:t>
+      </w:r>
+      <w:r>
+        <w:br/>
+      </w:r>
+      <w:r>
+        <w:br/>
+      </w:r>
+      <w:r>
+        <w:rPr>
+          <w:b/>
+          <w:bCs/>
+          <w:i/>
+          <w:iCs/>
+        </w:rPr>
+        <w:lastRenderedPageBreak/>
+        <w:br/>
+      </w:r>
+      <w:r>
+        <w:rPr>
+          <w:b/>
+          <w:bCs/>
+          <w:i/>
+          <w:iCs/>
+        </w:rPr>
         <w:t>Cotizaciones</w:t>
       </w:r>
     </w:p>
@@ -74,6 +478,21 @@
       </w:r>
       <w:r>
         <w:t xml:space="preserve">ase lista </w:t>
+      </w:r>
+      <w:r>
+        <w:t>- siguiendo el patrón de diseño tenemos un listado de cotizaciones el cual esta formado por Nombre de la Obra – Cliente – Enviado Proveedor – Enviado Cliente – Confirmado – Estado – Acciones</w:t>
+      </w:r>
+      <w:r>
+        <w:br/>
+        <w:t xml:space="preserve"> donde las columnas: enviado Cliente, Enviado Proveedor y Confirmado son </w:t>
+      </w:r>
+      <w:proofErr w:type="spellStart"/>
+      <w:r>
+        <w:t>checks</w:t>
+      </w:r>
+      <w:proofErr w:type="spellEnd"/>
+      <w:r>
+        <w:t xml:space="preserve">. </w:t>
       </w:r>
     </w:p>
     <w:p>
@@ -120,6 +539,84 @@
     </w:p>
     <w:p>
       <w:r>
+        <w:t xml:space="preserve">Se necesita crear una tabla en la base de datos que relacione la visita y </w:t>
+      </w:r>
+      <w:r>
+        <w:t>esta nueva tabla llamada cotizaciones la cual tiene los campos</w:t>
+      </w:r>
+      <w:r>
+        <w:t>:</w:t>
+      </w:r>
+      <w:r>
+        <w:t xml:space="preserve"> secuencial, </w:t>
+      </w:r>
+      <w:proofErr w:type="spellStart"/>
+      <w:r>
+        <w:t>secVisita</w:t>
+      </w:r>
+      <w:proofErr w:type="spellEnd"/>
+      <w:r>
+        <w:t xml:space="preserve">, </w:t>
+      </w:r>
+      <w:proofErr w:type="spellStart"/>
+      <w:r>
+        <w:t>EnviadoProveedor</w:t>
+      </w:r>
+      <w:proofErr w:type="spellEnd"/>
+      <w:r>
+        <w:t xml:space="preserve">, </w:t>
+      </w:r>
+      <w:proofErr w:type="spellStart"/>
+      <w:r>
+        <w:t>enviadoCliente</w:t>
+      </w:r>
+      <w:proofErr w:type="spellEnd"/>
+      <w:r>
+        <w:t xml:space="preserve">, </w:t>
+      </w:r>
+      <w:proofErr w:type="spellStart"/>
+      <w:r>
+        <w:t>Confirmacion</w:t>
+      </w:r>
+      <w:proofErr w:type="spellEnd"/>
+      <w:r>
+        <w:t xml:space="preserve">, </w:t>
+      </w:r>
+      <w:proofErr w:type="spellStart"/>
+      <w:r>
+        <w:t>EstaActivo</w:t>
+      </w:r>
+      <w:proofErr w:type="spellEnd"/>
+      <w:r>
+        <w:t>.</w:t>
+      </w:r>
+      <w:r>
+        <w:br/>
+        <w:t>Se selecciona el botón de editar y se muestra un modal con una tarjeta en la cual tenemos los datos de la Obra, los datos de contacto en una segunda tarjeta mostramos el mismo listado que usamos en detalle visita agregándole unas columnas adicionales, valor compra registramos a como se compró el ítem, en la columna Margen de ganancias se podrá ingresar un valor</w:t>
+      </w:r>
+      <w:r>
+        <w:t xml:space="preserve"> de 0 a 100 para que se maneje como porcentaje. El campo total mostrara el valor calculado entre la multiplicación del valor de compra y el margen de ganancia.</w:t>
+      </w:r>
+      <w:r>
+        <w:br/>
+      </w:r>
+      <w:r>
+        <w:br/>
+        <w:t>En la parte inferior mostraremos casilla ubicadas del lado derecho de la pantalla con el subtotal que es la sumatoria de los ítems del listado del punto anterior.</w:t>
+      </w:r>
+    </w:p>
+    <w:p>
+      <w:r>
+        <w:t>Se ha creado un documento con el detalle del proceso a seguir con la tabla impuestos y CRUD que se debe crear para poder llenar la tabla impuestos.</w:t>
+      </w:r>
+      <w:r>
+        <w:br/>
+        <w:t>basado en esta tabla se va a aplicar las siguientes casillas de valores de impuestos aplicados a la cotización para obtener el total que se debe cobrar al cliente.</w:t>
+      </w:r>
+    </w:p>
+    <w:p/>
+    <w:p>
+      <w:r>
         <w:t xml:space="preserve">Pantalla </w:t>
       </w:r>
       <w:r>
@@ -143,6 +640,7 @@
         <w:rPr>
           <w:noProof/>
         </w:rPr>
+        <w:lastRenderedPageBreak/>
         <w:drawing>
           <wp:inline distT="0" distB="0" distL="0" distR="0" wp14:anchorId="3A73EFDF" wp14:editId="3E419EB6">
             <wp:extent cx="5084064" cy="2297111"/>
@@ -197,7 +695,6 @@
     <w:p/>
     <w:p/>
     <w:p/>
-    <w:p/>
     <w:p>
       <w:pPr>
         <w:rPr>
@@ -214,7 +711,6 @@
           <w:i/>
           <w:iCs/>
         </w:rPr>
-        <w:lastRenderedPageBreak/>
         <w:t xml:space="preserve">Seguimientos </w:t>
       </w:r>
     </w:p>
@@ -383,6 +879,7 @@
         <w:rPr>
           <w:noProof/>
         </w:rPr>
+        <w:lastRenderedPageBreak/>
         <w:drawing>
           <wp:inline distT="0" distB="0" distL="0" distR="0" wp14:anchorId="05E7AEDA" wp14:editId="26B425E4">
             <wp:extent cx="2999232" cy="2347506"/>
@@ -448,7 +945,6 @@
           <w:i/>
           <w:iCs/>
         </w:rPr>
-        <w:lastRenderedPageBreak/>
         <w:t>Pre-Contrato</w:t>
       </w:r>
       <w:r>
@@ -616,6 +1112,7 @@
         <w:rPr>
           <w:noProof/>
         </w:rPr>
+        <w:lastRenderedPageBreak/>
         <w:drawing>
           <wp:anchor distT="0" distB="0" distL="114300" distR="114300" simplePos="0" relativeHeight="251658240" behindDoc="0" locked="0" layoutInCell="1" allowOverlap="1" wp14:anchorId="1A89112C" wp14:editId="307B8846">
             <wp:simplePos x="0" y="0"/>
@@ -742,14 +1239,32 @@
     <w:p/>
     <w:p/>
     <w:p>
-      <w:r>
+      <w:pPr>
         <w:rPr>
           <w:b/>
           <w:bCs/>
           <w:i/>
           <w:iCs/>
         </w:rPr>
-        <w:lastRenderedPageBreak/>
+      </w:pPr>
+      <w:r>
+        <w:rPr>
+          <w:b/>
+          <w:bCs/>
+          <w:i/>
+          <w:iCs/>
+        </w:rPr>
+        <w:br/>
+      </w:r>
+    </w:p>
+    <w:p>
+      <w:r>
+        <w:rPr>
+          <w:b/>
+          <w:bCs/>
+          <w:i/>
+          <w:iCs/>
+        </w:rPr>
         <w:t>Contrato</w:t>
       </w:r>
       <w:r>
@@ -870,6 +1385,7 @@
         <w:rPr>
           <w:noProof/>
         </w:rPr>
+        <w:lastRenderedPageBreak/>
         <w:drawing>
           <wp:inline distT="0" distB="0" distL="0" distR="0" wp14:anchorId="48DBF818" wp14:editId="159DF910">
             <wp:extent cx="2809036" cy="1533524"/>
@@ -1341,7 +1857,6 @@
   <w:style w:type="character" w:default="1" w:styleId="Fuentedeprrafopredeter">
     <w:name w:val="Default Paragraph Font"/>
     <w:uiPriority w:val="1"/>
-    <w:semiHidden/>
     <w:unhideWhenUsed/>
   </w:style>
   <w:style w:type="table" w:default="1" w:styleId="Tablanormal">

</xml_diff>